<commit_message>
v9.0.0 (revised): defer figure/table callouts out of the first sentence after each Results subheading; regenerate md; verify 239/47/12
</commit_message>
<xml_diff>
--- a/manuscript/题目3手稿最新版本.docx
+++ b/manuscript/题目3手稿最新版本.docx
@@ -314,7 +314,7 @@
         <w:rPr>
           <w:b w:val="0"/>
         </w:rPr>
-        <w:t>Of 6,797 examined adults aged ≥40 with retinal photography, 5,704 had a gradable retinopathy image and 5,604 a gradable AMD image (Supplementary Table S1, Figure 1). Because the diagnosis-discordance outcome requires an answer to the corresponding self-report item, all denominators below are responders. Among adults with diabetes and objectively graded retinopathy (n = 319), 313 answered the diabetic-eye item and formed the DR denominator; six non-responders were excluded. Among adults with objectively graded AMD (n = 441), 436 answered the macular-degeneration item (five excluded). Multivariable models were smaller because education and income were missing, not because of the outcome: of the 313 DR responders, 102 lacked education and 30 lacked income, leaving 187 in the complete-case core model; of the 436 AMD responders, 188 lacked education and 42 lacked income, leaving 226 (Supplementary Table S1). Design degrees of freedom were computed with survey::degf() for each subset (Supplementary Table S3): the DR and AMD responder sets spanned 31 strata with 59 and 61 PSUs (design df 28 and 30), and the complete-case core models retained df 22 and 29. Regression inference used each model's residual degrees of freedom, degf(design) − model rank + 1 (13 for the eye-care model); Supplementary Table S3 reports the design df, rank, residual df, t-multiplier and every coefficient, standard error, confidence interval, raw P and Holm-adjusted P from the same fitted object, so intervals and P values cannot drift apart.</w:t>
+        <w:t>Of 6,797 examined adults aged ≥40 with retinal photography, 5,704 had a gradable retinopathy image and 5,604 a gradable AMD image. Because the diagnosis-discordance outcome requires an answer to the corresponding self-report item, all denominators below are responders (Figure 1). Among adults with diabetes and objectively graded retinopathy (n = 319), 313 answered the diabetic-eye item and formed the DR denominator; six non-responders were excluded. Among adults with objectively graded AMD (n = 441), 436 answered the macular-degeneration item (five excluded). Multivariable models were smaller because education and income were missing, not because of the outcome: of the 313 DR responders, 102 lacked education and 30 lacked income, leaving 187 in the complete-case core model; of the 436 AMD responders, 188 lacked education and 42 lacked income, leaving 226 (Supplementary Table S1). Design degrees of freedom were computed with survey::degf() for each subset (Supplementary Table S3): the DR and AMD responder sets spanned 31 strata with 59 and 61 PSUs (design df 28 and 30), and the complete-case core models retained df 22 and 29. Regression inference used each model's residual degrees of freedom, degf(design) − model rank + 1 (13 for the eye-care model); Supplementary Table S3 reports the design df, rank, residual df, t-multiplier and every coefficient, standard error, confidence interval, raw P and Holm-adjusted P from the same fitted object, so intervals and P values cannot drift apart.</w:t>
       </w:r>
     </w:p>
     <w:p>
@@ -375,7 +375,7 @@
         <w:rPr>
           <w:b w:val="0"/>
         </w:rPr>
-        <w:t>Among adults with diabetes who had objectively graded retinopathy and answered the item, 70.2% (63.8–75.9) reported no prior diabetic-eye diagnosis (Table 2, Figure 2). Among adults with objectively graded AMD who answered the item, 82.2% (77.3–86.2) reported no prior macular-degeneration diagnosis, and even among those with late AMD — the stage most likely to be symptomatic — 41.4% (25.3–59.6) reported no diagnosis (n = 55). The outcome is the absence of a recalled, patient-reported diagnosis, not a chart-confirmed absence of diagnosis. We do not estimate a diagnosis gap for people with objectively graded retinopathy who do not report diabetes, because the diabetic-eye item (DIQ080) is asked only of people with diabetes; the appropriate denominator is therefore diabetic respondents (n = 313). Extreme-scenario bounds that assign the six DR and five AMD item non-responders first to "diagnosed" and then to "undiagnosed" move the weighted estimates only marginally (DR 69.2–70.6%, AMD 81.6–82.3%), so the headline gaps are not an artefact of non-response (Supplementary Table S9).</w:t>
+        <w:t>Among adults with diabetes who had objectively graded retinopathy and answered the item, 70.2% (63.8–75.9) reported no prior diabetic-eye diagnosis. Among adults with objectively graded AMD who answered the item, 82.2% (77.3–86.2) reported no prior macular-degeneration diagnosis, and even among those with late AMD — the stage most likely to be symptomatic — 41.4% (25.3–59.6) reported no diagnosis (n = 55; Table 2, Figure 2). The outcome is the absence of a recalled, patient-reported diagnosis, not a chart-confirmed absence of diagnosis. We do not estimate a diagnosis gap for people with objectively graded retinopathy who do not report diabetes, because the diabetic-eye item (DIQ080) is asked only of people with diabetes; the appropriate denominator is therefore diabetic respondents (n = 313). Extreme-scenario bounds that assign the six DR and five AMD item non-responders first to "diagnosed" and then to "undiagnosed" move the weighted estimates only marginally (DR 69.2–70.6%, AMD 81.6–82.3%), so the headline gaps are not an artefact of non-response (Supplementary Table S9).</w:t>
       </w:r>
     </w:p>
     <w:p>
@@ -406,7 +406,7 @@
           <w:rFonts w:hint="default" w:ascii="Calibri" w:hAnsi="Calibri" w:eastAsia="Arial" w:cs="Calibri"/>
           <w:b w:val="0"/>
         </w:rPr>
-        <w:t>Among adults with diabetes, 35.8% (31.3–40.5) had not had a dilated eye examination within 12 months; restricting to those with objectively graded retinopathy, 32.4% (25.9–39.7) had not (Table 2). Because clinical guidance permits intervals longer than 12 months for some low-risk patients, this measure reflects "not examined within 12 months" rather than "not following an individualised guideline."</w:t>
+        <w:t>Among adults with diabetes, 35.8% (31.3–40.5) had not had a dilated eye examination within 12 months; restricting to those with objectively graded retinopathy, 32.4% (25.9–39.7) had not. Because clinical guidance permits intervals longer than 12 months for some low-risk patients, this measure reflects "not examined within 12 months" rather than "not following an individualised guideline" (Table 2).</w:t>
       </w:r>
     </w:p>
     <w:p>
@@ -433,7 +433,7 @@
         </w:rPr>
       </w:pPr>
       <w:r>
-        <w:t>Self-reported diagnosis rose steeply with retinopathy severity among adults with diabetes — from 16.6% with no gradable retinopathy, to 21.9% mild, 35.6% moderate, and 84.3% severe-or-proliferative retinopathy — and the corresponding diagnosis gap fell from 78.1% (71.3–83.7) for mild, to 64.4% (48.3–77.8) moderate, to 15.7% (5.0–39.7) severe-or-proliferative retinopathy (Figure 2, panel a; Supplementary Table S2). AMD discordance was similarly graded: the gap was higher for early AMD — 87.9% (84.4–90.6), n = 381 — than for late AMD (41.4%, 25.3–59.6, n = 55), each computed from its own responder set (Figure 2, panel b). By age stratum, AMD discordance was near-complete at 40–59 years (99.1%, 95.6–99.8), fell to 86.6% (77.8–92.3) at 60–74 and 66.7% (60.1–72.6) at ≥75, whereas the DR gap was flatter (Supplementary Table S2). The severe-DR and late-AMD strata are small and their intervals wide, so the fall in discordance with severity is best read as a graded descriptive pattern rather than a series of individually tested contrasts.</w:t>
+        <w:t>Self-reported diagnosis rose steeply with retinopathy severity among adults with diabetes. The proportion reporting no prior diagnosis fell from 78.1% (71.3–83.7) for mild NPDR (n = 197), to 64.4% (48.3–77.8) for moderate (n = 85), to 15.7% (5.0–39.7) for severe-or-proliferative retinopathy (n = 31), while the percentage actually diagnosed rose across the same tiers from 16.6% among those with no gradable retinopathy to 21.9%, 35.6% and 84.3% (Figure 2, panel a; Supplementary Table S2). AMD discordance was similarly graded: the gap was higher for early AMD — 87.9% (84.4–90.6), n = 381 — than for late AMD (41.4%, 25.3–59.6, n = 55), each computed from its own responder set (Figure 2, panel b). By age stratum, AMD discordance was near-complete at 40–59 years (99.1%, 95.6–99.8), fell to 86.6% (77.8–92.3) at 60–74 and 66.7% (60.1–72.6) at ≥75, whereas the DR gap was flatter (Supplementary Table S2). The severe-DR and late-AMD strata are small and their intervals wide, so the fall in discordance with severity is best read as a graded descriptive pattern rather than a series of individually tested contrasts.</w:t>
       </w:r>
     </w:p>
     <w:p>
@@ -463,7 +463,7 @@
         <w:rPr>
           <w:b w:val="0"/>
         </w:rPr>
-        <w:t>Reframing around clinically more advanced disease, the diagnosis gap remained substantial at or above the moderate-non-proliferative threshold: among adults with diabetes and moderate-or-worse retinopathy (n = 116) the pooled gap was 53.4% (38.7–67.5), comprising 64.4% (48.3–77.8) for moderate and 15.7% (5.0–39.7) for severe-or-proliferative retinopathy (Figure 2, panel a). For AMD, 41.4% (25.3–59.6) of objectively graded late AMD carried no reported diagnosis. The "moderate-or-worse" grouping denotes clinically more advanced disease, not a treatable or immediately blinding category — moderate non-proliferative retinopathy is typically monitored rather than treated — and imaging severity is not a treatment indication. Splitting late AMD, geographic atrophy was undiagnosed in 50.3% (26.6–73.9; n = 32) and exudative/neovascular AMD in 27.7% (8.0–62.9; n = 23); both strata are small with widely overlapping intervals, so this difference is not an established group difference. The two phenotypes also differ in therapy and in treatability at the time these data were collected.</w:t>
+        <w:t>Reframing around clinically more advanced disease, the diagnosis gap remained substantial at or above the moderate-non-proliferative threshold. Among adults with diabetes and moderate-or-worse retinopathy (n = 116) the pooled gap was 53.4% (38.7–67.5), comprising 64.4% (48.3–77.8) for moderate and 15.7% (5.0–39.7) for severe-or-proliferative retinopathy (Figure 2, panel a). For AMD, 41.4% (25.3–59.6) of objectively graded late AMD carried no reported diagnosis. The "moderate-or-worse" grouping denotes clinically more advanced disease, not a treatable or immediately blinding category — moderate non-proliferative retinopathy is typically monitored rather than treated — and imaging severity is not a treatment indication. Splitting late AMD, geographic atrophy was undiagnosed in 50.3% (26.6–73.9; n = 32) and exudative/neovascular AMD in 27.7% (8.0–62.9; n = 23); both strata are small with widely overlapping intervals, so this difference is not an established group difference. The two phenotypes also differ in therapy and in treatability at the time these data were collected.</w:t>
       </w:r>
     </w:p>
     <w:p>
@@ -553,7 +553,7 @@
         <w:rPr>
           <w:b w:val="0"/>
         </w:rPr>
-        <w:t>Images were ungradable for 1,093 participants, who differed from gradable participants: they were older (mean 64.5 vs 59.6 years), more often diabetic (22.1% vs 15.9%) and more likely to have less than a high-school education (23.2% vs 14.4%) (Supplementary Table S5). To test whether this imbalance biases estimates, we reweighted gradable participants by the inverse probability of a gradable image. A base model (age, sex, race/ethnicity) moved whole-population prevalence only slightly (any retinopathy 9.75% → 9.98%; any AMD 6.58% → 6.87%); an extended model adding diabetes, insurance and education gave 9.75% → 10.13% and 6.58% → 6.77%. The inverse-probability factors were modest (1/P about 1.0–1.8; the smallest predicted gradability probability was 0.57, so the 0.05 floor never bound and no observation was truncated), and the Kish effective sample size of the combined weights (≈3,635–3,656 of 5,704) stayed close to the raw-weight value (≈3,508). This stability check is limited; an unchanged aggregate ESS can still sit alongside a long weight tail and speaks only to observable differences. The diagnosis gaps themselves were essentially unchanged under IPW (DR 70.2% → 70.2%; AMD 82.2% → 82.0%). The descriptive prevalence and primary discordance proportions therefore move little under observable gradable-vs-ungradable reweighting; inverse-probability weighting cannot address unmeasured selection (Supplementary Table S5).</w:t>
+        <w:t>Images were ungradable for 1,093 participants, who differed from gradable participants: they were older (mean 64.5 vs 59.6 years), more often diabetic (22.1% vs 15.9%) and more likely to have less than a high-school education (23.2% vs 14.4%). To test whether this imbalance biases estimates, we reweighted gradable participants by the inverse probability of a gradable image. A base model (age, sex, race/ethnicity) moved whole-population prevalence only slightly (any retinopathy 9.75% → 9.98%; any AMD 6.58% → 6.87%); an extended model adding diabetes, insurance and education gave 9.75% → 10.13% and 6.58% → 6.77%. The inverse-probability factors were modest (1/P about 1.0–1.8; the smallest predicted gradability probability was 0.57, so the 0.05 floor never bound and no observation was truncated), and the Kish effective sample size of the combined weights (≈3,635–3,656 of 5,704) stayed close to the raw-weight value (≈3,508). This stability check is limited; an unchanged aggregate ESS can still sit alongside a long weight tail and speaks only to observable differences. The diagnosis gaps themselves were essentially unchanged under IPW (DR 70.2% → 70.2%; AMD 82.2% → 82.0%). The descriptive prevalence and primary discordance proportions therefore move little under observable gradable-vs-ungradable reweighting; inverse-probability weighting cannot address unmeasured selection (Supplementary Table S5).</w:t>
       </w:r>
     </w:p>
     <w:p>
@@ -583,7 +583,7 @@
         <w:rPr>
           <w:b w:val="0"/>
         </w:rPr>
-        <w:t>In NHIS 2016, weighted self-reported prevalence among adults ≥40 was 2.66% (2.40–2.91) for macular degeneration and 1.27% (1.09–1.46) for diabetic retinopathy; 48.7% (47.7–49.7) had seen an eye doctor and 49.9% (48.9–51.0) had a dilated examination within 12 months (Table S6). Self-reported glaucoma (3.97%) and cataract (21.17%) are reported in Supplementary Table S6 and, being outside the objective-versus-reported comparison, are not carried into the main analysis; the NHIS cataract item ("ever told you had cataract") is also a different construct from the NHANES cataract-surgery history in Table 1, so the two are not compared directly. Directly age-standardising the NHIS macular-degeneration proportion (2.66% crude) to the NHANES 40+ age structure yielded 2.45% (2.22–2.69) using the full design-based covariance of the age-band estimates; age-and-sex standardisation gave 2.46% (2.22–2.70) (Figure S1; Supplementary Table S6). The difference between objectively graded AMD (6.58%) and age-standardised self-report persisted after standardisation, but it cannot be attributed specifically to diagnostic unawareness because the surveys differ in calendar period, ascertainment and respondents. NHIS is therefore an auxiliary contextual benchmark, not a paired validation of individual diagnosis status.</w:t>
+        <w:t>In NHIS 2016, weighted self-reported prevalence among adults ≥40 was 2.66% (2.40–2.91) for macular degeneration and 1.27% (1.09–1.46) for diabetic retinopathy; 48.7% (47.7–49.7) had seen an eye doctor and 49.9% (48.9–51.0) had a dilated examination within 12 months. Self-reported glaucoma (3.97%) and cataract (21.17%) are reported in Supplementary Table S6 and, being outside the objective-versus-reported comparison, are not carried into the main analysis; the NHIS cataract item ("ever told you had cataract") is also a different construct from the NHANES cataract-surgery history in Table 1, so the two are not compared directly. Directly age-standardising the NHIS macular-degeneration proportion (2.66% crude) to the NHANES 40+ age structure yielded 2.45% (2.22–2.69) using the full design-based covariance of the age-band estimates; age-and-sex standardisation gave 2.46% (2.22–2.70) (Figure S1; Supplementary Table S6). The difference between objectively graded AMD (6.58%) and age-standardised self-report persisted after standardisation, but it cannot be attributed specifically to diagnostic unawareness because the surveys differ in calendar period, ascertainment and respondents. NHIS is therefore an auxiliary contextual benchmark, not a paired validation of individual diagnosis status.</w:t>
       </w:r>
     </w:p>
     <w:p>

</xml_diff>

<commit_message>
v10.0.0 (figures): embed current main Fig1-3 (replace stale images), remove the two supplementary figure legends from the main manuscript so legends<->images match 3<->3; regenerate md; verify 239/47/12.
</commit_message>
<xml_diff>
--- a/manuscript/题目3手稿最新版本.docx
+++ b/manuscript/题目3手稿最新版本.docx
@@ -1582,36 +1582,6 @@
     </w:p>
     <w:p>
       <w:pPr>
-        <w:spacing w:after="120" w:line="360" w:lineRule="auto"/>
-        <w:rPr>
-          <w:rFonts w:hint="default" w:ascii="Calibri" w:hAnsi="Calibri" w:cs="Calibri"/>
-        </w:rPr>
-      </w:pPr>
-      <w:r>
-        <w:rPr>
-          <w:rFonts w:hint="default" w:ascii="Calibri" w:hAnsi="Calibri" w:cs="Calibri"/>
-          <w:b/>
-        </w:rPr>
-        <w:t>Figure S1. Grading-feasibility sensitivity: naive (gradable-only) versus inverse-probability-weighted whole-population prevalence of any retinopathy and any AMD under a base (age, sex, race) and an extended (+ diabetes, insurance, education) gradability model. IPW shifts each estimate by ≤ 0.6 percentage points, indicating observable gradable-vs-ungradable differences do not materially move the descriptive prevalence (full weight decomposition in Supplementary Table S8).</w:t>
-      </w:r>
-    </w:p>
-    <w:p>
-      <w:pPr>
-        <w:spacing w:after="120" w:line="360" w:lineRule="auto"/>
-        <w:rPr>
-          <w:rFonts w:hint="default" w:ascii="Calibri" w:hAnsi="Calibri" w:cs="Calibri"/>
-        </w:rPr>
-      </w:pPr>
-      <w:r>
-        <w:rPr>
-          <w:rFonts w:hint="default" w:ascii="Calibri" w:hAnsi="Calibri" w:cs="Calibri"/>
-          <w:b/>
-        </w:rPr>
-        <w:t>Figure S2. Objectively graded versus self-reported AMD among US adults ≥ 40: NHANES retinal-photograph grading (2005–2008, weighted 6.58%) compared with NHIS self-reported diagnosis (2016, survey-weighted crude 2.66% and age-standardised 2.45% to the NHANES 40+ structure). The surveys differ in instrument, year and measurement method and are shown only as a contextual comparison; bars show 95% CIs. The age-standardised CI is conditional on the fixed NHANES-derived standard weights.</w:t>
-      </w:r>
-    </w:p>
-    <w:p>
-      <w:pPr>
         <w:spacing w:after="160" w:line="360" w:lineRule="auto"/>
         <w:jc w:val="center"/>
         <w:rPr>
@@ -1619,28 +1589,22 @@
         </w:rPr>
       </w:pPr>
       <w:r>
-        <w:rPr>
-          <w:rFonts w:hint="default" w:ascii="Calibri" w:hAnsi="Calibri" w:cs="Calibri"/>
-        </w:rPr>
         <w:drawing>
-          <wp:inline distT="0" distB="0" distL="114300" distR="114300">
-            <wp:extent cx="2339975" cy="1799590"/>
-            <wp:effectExtent l="0" t="0" r="3175" b="10160"/>
-            <wp:docPr id="7" name="Picture 7"/>
+          <wp:inline xmlns:a="http://schemas.openxmlformats.org/drawingml/2006/main" xmlns:pic="http://schemas.openxmlformats.org/drawingml/2006/picture">
+            <wp:extent cx="2339975" cy="1800333"/>
+            <wp:docPr id="10" name="Picture 10"/>
             <wp:cNvGraphicFramePr>
-              <a:graphicFrameLocks xmlns:a="http://schemas.openxmlformats.org/drawingml/2006/main" noChangeAspect="1"/>
+              <a:graphicFrameLocks noChangeAspect="1"/>
             </wp:cNvGraphicFramePr>
-            <a:graphic xmlns:a="http://schemas.openxmlformats.org/drawingml/2006/main">
+            <a:graphic>
               <a:graphicData uri="http://schemas.openxmlformats.org/drawingml/2006/picture">
-                <pic:pic xmlns:pic="http://schemas.openxmlformats.org/drawingml/2006/picture">
+                <pic:pic>
                   <pic:nvPicPr>
-                    <pic:cNvPr id="7" name="Picture 7"/>
-                    <pic:cNvPicPr>
-                      <a:picLocks noChangeAspect="1"/>
-                    </pic:cNvPicPr>
+                    <pic:cNvPr id="0" name="Fig1_flowchart.png"/>
+                    <pic:cNvPicPr/>
                   </pic:nvPicPr>
                   <pic:blipFill>
-                    <a:blip r:embed="rId5"/>
+                    <a:blip r:embed="rId11"/>
                     <a:stretch>
                       <a:fillRect/>
                     </a:stretch>
@@ -1648,11 +1612,9 @@
                   <pic:spPr>
                     <a:xfrm>
                       <a:off x="0" y="0"/>
-                      <a:ext cx="2340000" cy="1800000"/>
+                      <a:ext cx="2339975" cy="1800333"/>
                     </a:xfrm>
-                    <a:prstGeom prst="rect">
-                      <a:avLst/>
-                    </a:prstGeom>
+                    <a:prstGeom prst="rect"/>
                   </pic:spPr>
                 </pic:pic>
               </a:graphicData>
@@ -1670,28 +1632,22 @@
         </w:rPr>
       </w:pPr>
       <w:r>
-        <w:rPr>
-          <w:rFonts w:hint="default" w:ascii="Calibri" w:hAnsi="Calibri" w:cs="Calibri"/>
-        </w:rPr>
         <w:drawing>
-          <wp:inline distT="0" distB="0" distL="114300" distR="114300">
-            <wp:extent cx="2339975" cy="1799590"/>
-            <wp:effectExtent l="0" t="0" r="3175" b="10160"/>
-            <wp:docPr id="8" name="Picture 8"/>
+          <wp:inline xmlns:a="http://schemas.openxmlformats.org/drawingml/2006/main" xmlns:pic="http://schemas.openxmlformats.org/drawingml/2006/picture">
+            <wp:extent cx="2339975" cy="1800333"/>
+            <wp:docPr id="11" name="Picture 11"/>
             <wp:cNvGraphicFramePr>
-              <a:graphicFrameLocks xmlns:a="http://schemas.openxmlformats.org/drawingml/2006/main" noChangeAspect="1"/>
+              <a:graphicFrameLocks noChangeAspect="1"/>
             </wp:cNvGraphicFramePr>
-            <a:graphic xmlns:a="http://schemas.openxmlformats.org/drawingml/2006/main">
+            <a:graphic>
               <a:graphicData uri="http://schemas.openxmlformats.org/drawingml/2006/picture">
-                <pic:pic xmlns:pic="http://schemas.openxmlformats.org/drawingml/2006/picture">
+                <pic:pic>
                   <pic:nvPicPr>
-                    <pic:cNvPr id="8" name="Picture 8"/>
-                    <pic:cNvPicPr>
-                      <a:picLocks noChangeAspect="1"/>
-                    </pic:cNvPicPr>
+                    <pic:cNvPr id="0" name="Fig2_gradient_forest.png"/>
+                    <pic:cNvPicPr/>
                   </pic:nvPicPr>
                   <pic:blipFill>
-                    <a:blip r:embed="rId6"/>
+                    <a:blip r:embed="rId12"/>
                     <a:stretch>
                       <a:fillRect/>
                     </a:stretch>
@@ -1699,11 +1655,9 @@
                   <pic:spPr>
                     <a:xfrm>
                       <a:off x="0" y="0"/>
-                      <a:ext cx="2340000" cy="1800000"/>
+                      <a:ext cx="2339975" cy="1800333"/>
                     </a:xfrm>
-                    <a:prstGeom prst="rect">
-                      <a:avLst/>
-                    </a:prstGeom>
+                    <a:prstGeom prst="rect"/>
                   </pic:spPr>
                 </pic:pic>
               </a:graphicData>
@@ -1721,28 +1675,22 @@
         </w:rPr>
       </w:pPr>
       <w:r>
-        <w:rPr>
-          <w:rFonts w:hint="default" w:ascii="Calibri" w:hAnsi="Calibri" w:cs="Calibri"/>
-        </w:rPr>
         <w:drawing>
-          <wp:inline distT="0" distB="0" distL="114300" distR="114300">
+          <wp:inline xmlns:a="http://schemas.openxmlformats.org/drawingml/2006/main" xmlns:pic="http://schemas.openxmlformats.org/drawingml/2006/picture">
             <wp:extent cx="1799590" cy="1799590"/>
-            <wp:effectExtent l="0" t="0" r="10160" b="10160"/>
-            <wp:docPr id="9" name="Picture 9"/>
+            <wp:docPr id="12" name="Picture 12"/>
             <wp:cNvGraphicFramePr>
-              <a:graphicFrameLocks xmlns:a="http://schemas.openxmlformats.org/drawingml/2006/main" noChangeAspect="1"/>
+              <a:graphicFrameLocks noChangeAspect="1"/>
             </wp:cNvGraphicFramePr>
-            <a:graphic xmlns:a="http://schemas.openxmlformats.org/drawingml/2006/main">
+            <a:graphic>
               <a:graphicData uri="http://schemas.openxmlformats.org/drawingml/2006/picture">
-                <pic:pic xmlns:pic="http://schemas.openxmlformats.org/drawingml/2006/picture">
+                <pic:pic>
                   <pic:nvPicPr>
-                    <pic:cNvPr id="9" name="Picture 9"/>
-                    <pic:cNvPicPr>
-                      <a:picLocks noChangeAspect="1"/>
-                    </pic:cNvPicPr>
+                    <pic:cNvPr id="0" name="Fig3_eyecare_dots.png"/>
+                    <pic:cNvPicPr/>
                   </pic:nvPicPr>
                   <pic:blipFill>
-                    <a:blip r:embed="rId7"/>
+                    <a:blip r:embed="rId13"/>
                     <a:stretch>
                       <a:fillRect/>
                     </a:stretch>
@@ -1750,11 +1698,9 @@
                   <pic:spPr>
                     <a:xfrm>
                       <a:off x="0" y="0"/>
-                      <a:ext cx="1800000" cy="1800000"/>
+                      <a:ext cx="1799590" cy="1799590"/>
                     </a:xfrm>
-                    <a:prstGeom prst="rect">
-                      <a:avLst/>
-                    </a:prstGeom>
+                    <a:prstGeom prst="rect"/>
                   </pic:spPr>
                 </pic:pic>
               </a:graphicData>

</xml_diff>

<commit_message>
v10.0.0: align declarations with Nature Portfolio/Sci Rep (Ethics + generative-AI into Methods; Data->Code->Author contributions->Funding->Competing interests->Additional information).
</commit_message>
<xml_diff>
--- a/manuscript/题目3手稿最新版本.docx
+++ b/manuscript/题目3手稿最新版本.docx
@@ -835,6 +835,37 @@
     </w:p>
     <w:p>
       <w:pPr>
+        <w:spacing w:after="120" w:line="360" w:lineRule="auto"/>
+        <w:rPr>
+          <w:rFonts w:hint="default" w:ascii="Calibri" w:hAnsi="Calibri" w:cs="Calibri"/>
+        </w:rPr>
+      </w:pPr>
+      <w:r>
+        <w:rPr>
+          <w:rFonts w:hint="default" w:ascii="Calibri" w:hAnsi="Calibri" w:eastAsia="Arial" w:cs="Calibri"/>
+          <w:b w:val="0"/>
+          <w:bCs w:val="0"/>
+        </w:rPr>
+        <w:t>Ethics approval and consent to participate. This is a secondary analysis of de-identified, publicly available NHANES and NHIS data and was exempt from further institutional review. The original surveys were approved by the National Center for Health Statistics Research Ethics Review Board, and all participants provided written informed consent.</w:t>
+      </w:r>
+    </w:p>
+    <w:p>
+      <w:pPr>
+        <w:spacing w:after="120" w:line="360" w:lineRule="auto"/>
+        <w:rPr>
+          <w:rFonts w:hint="default" w:ascii="Calibri" w:hAnsi="Calibri" w:cs="Calibri"/>
+        </w:rPr>
+      </w:pPr>
+      <w:r>
+        <w:rPr>
+          <w:rFonts w:hint="default" w:ascii="Calibri" w:hAnsi="Calibri" w:cs="Calibri"/>
+          <w:b w:val="0"/>
+        </w:rPr>
+        <w:t>Declaration of generative AI in scientific writing. The authors used an AI coding assistant (QoderWork) to help write and debug the analysis scripts and to assist in drafting and editing the manuscript. After using the tool, the authors reviewed and edited the content as needed and take full responsibility for the published article. No AI tool meets the ICMJE authorship criteria and none is listed as an author.</w:t>
+      </w:r>
+    </w:p>
+    <w:p>
+      <w:pPr>
         <w:pStyle w:val="3"/>
         <w:spacing w:line="360" w:lineRule="auto"/>
         <w:rPr>
@@ -1293,223 +1324,6 @@
     </w:p>
     <w:p>
       <w:pPr>
-        <w:spacing w:after="120" w:line="360" w:lineRule="auto"/>
-        <w:rPr>
-          <w:rFonts w:hint="default" w:ascii="Calibri" w:hAnsi="Calibri" w:cs="Calibri"/>
-        </w:rPr>
-      </w:pPr>
-      <w:r>
-        <w:rPr>
-          <w:rFonts w:hint="default" w:ascii="Calibri" w:hAnsi="Calibri" w:eastAsia="Arial" w:cs="Calibri"/>
-          <w:b w:val="0"/>
-          <w:bCs w:val="0"/>
-        </w:rPr>
-        <w:t>Ethics.</w:t>
-      </w:r>
-      <w:r>
-        <w:rPr>
-          <w:rFonts w:hint="default" w:ascii="Calibri" w:hAnsi="Calibri" w:eastAsia="Arial" w:cs="Calibri"/>
-          <w:b w:val="0"/>
-        </w:rPr>
-        <w:t xml:space="preserve"> Secondary analysis of de-identified public NHANES/NHIS data; exempt. Original surveys approved by the NCHS Research Ethics Review Board with written informed consent.</w:t>
-      </w:r>
-    </w:p>
-    <w:p>
-      <w:pPr>
-        <w:spacing w:after="120" w:line="360" w:lineRule="auto"/>
-        <w:rPr>
-          <w:rFonts w:hint="default" w:ascii="Calibri" w:hAnsi="Calibri" w:cs="Calibri"/>
-        </w:rPr>
-      </w:pPr>
-      <w:r>
-        <w:rPr>
-          <w:rFonts w:hint="default" w:ascii="Calibri" w:hAnsi="Calibri" w:cs="Calibri"/>
-          <w:b w:val="0"/>
-          <w:bCs/>
-        </w:rPr>
-        <w:t>Code availability.</w:t>
-      </w:r>
-      <w:r>
-        <w:rPr>
-          <w:rFonts w:hint="default" w:ascii="Calibri" w:hAnsi="Calibri" w:cs="Calibri"/>
-          <w:b w:val="0"/>
-        </w:rPr>
-        <w:t xml:space="preserve"> </w:t>
-      </w:r>
-      <w:bookmarkStart w:id="0" w:name="_GoBack"/>
-      <w:bookmarkEnd w:id="0"/>
-      <w:r>
-        <w:rPr>
-          <w:rFonts w:hint="default" w:ascii="Calibri" w:hAnsi="Calibri" w:cs="Calibri"/>
-          <w:b w:val="0"/>
-        </w:rPr>
-        <w:t>The code used to produce all results in this study is available in a public GitHub repository at https://github.com/teamhuang/eye3-nhanes-diagnosis-care-gap (version-tagged release: https://github.com/teamhuang/eye3-nhanes-diagnosis-care-gap/releases/tag/v10.0.0).</w:t>
-      </w:r>
-    </w:p>
-    <w:p>
-      <w:pPr>
-        <w:spacing w:after="120" w:line="360" w:lineRule="auto"/>
-        <w:rPr>
-          <w:rFonts w:hint="default" w:ascii="Calibri" w:hAnsi="Calibri" w:cs="Calibri"/>
-        </w:rPr>
-      </w:pPr>
-      <w:r>
-        <w:rPr>
-          <w:rFonts w:hint="default" w:ascii="Calibri" w:hAnsi="Calibri" w:cs="Calibri"/>
-          <w:b w:val="0"/>
-        </w:rPr>
-        <w:t>The authors used an AI coding assistant (QoderWork) to help write and debug the analysis scripts and to assist in drafting and editing the manuscript. All statistical outputs, numbers, code and prose were independently checked by the authors, who take full responsibility for them and confirmed their accuracy before submission. No AI tool meets the ICMJE authorship criteria and none is listed as an author, consistent with ICMJE and Scientific Reports policy.</w:t>
-      </w:r>
-    </w:p>
-    <w:p>
-      <w:pPr>
-        <w:pStyle w:val="3"/>
-        <w:spacing w:line="360" w:lineRule="auto"/>
-        <w:rPr>
-          <w:rFonts w:hint="default" w:ascii="Calibri" w:hAnsi="Calibri" w:cs="Calibri"/>
-        </w:rPr>
-      </w:pPr>
-      <w:r>
-        <w:rPr>
-          <w:rFonts w:hint="default" w:ascii="Calibri" w:hAnsi="Calibri" w:eastAsia="Arial" w:cs="Calibri"/>
-          <w:b/>
-        </w:rPr>
-        <w:t>Data availability</w:t>
-      </w:r>
-    </w:p>
-    <w:p>
-      <w:pPr>
-        <w:spacing w:after="120" w:line="360" w:lineRule="auto"/>
-        <w:rPr>
-          <w:rFonts w:hint="default" w:ascii="Calibri" w:hAnsi="Calibri" w:cs="Calibri"/>
-        </w:rPr>
-      </w:pPr>
-      <w:r>
-        <w:rPr>
-          <w:rFonts w:hint="default" w:ascii="Calibri" w:hAnsi="Calibri" w:eastAsia="Arial" w:cs="Calibri"/>
-          <w:b w:val="0"/>
-        </w:rPr>
-        <w:t>NHANES 2005–2008 retinal-photography (OPXRET), Vision (VIQ), Diabetes (DIQ), Demographics (DEMO), Health-Utilisation (HUQ) and Health-Insurance (HIQ) files, and the 2016 NHIS Sample Adult file, are publicly available from the National Center for Health Statistics, CDC (https://wwwn.cdc.gov/nchs/nhanes/ and https://ftp.cdc.gov/pub/Health_Statistics/NCHS/Datasets/NHIS/2016/). These are third-party public-use data; no individual-level data are redistributed here. This work is a secondary analysis of previously collected data.</w:t>
-      </w:r>
-    </w:p>
-    <w:p>
-      <w:pPr>
-        <w:pStyle w:val="3"/>
-        <w:spacing w:line="360" w:lineRule="auto"/>
-        <w:rPr>
-          <w:rFonts w:hint="default" w:ascii="Calibri" w:hAnsi="Calibri" w:cs="Calibri"/>
-        </w:rPr>
-      </w:pPr>
-      <w:r>
-        <w:rPr>
-          <w:rFonts w:hint="default" w:ascii="Calibri" w:hAnsi="Calibri" w:eastAsia="Arial" w:cs="Calibri"/>
-          <w:b/>
-        </w:rPr>
-        <w:t>Funding</w:t>
-      </w:r>
-    </w:p>
-    <w:p>
-      <w:pPr>
-        <w:spacing w:after="120" w:line="360" w:lineRule="auto"/>
-        <w:rPr>
-          <w:rFonts w:hint="default" w:ascii="Calibri" w:hAnsi="Calibri" w:cs="Calibri"/>
-        </w:rPr>
-      </w:pPr>
-      <w:r>
-        <w:rPr>
-          <w:rFonts w:hint="default" w:ascii="Calibri" w:hAnsi="Calibri" w:eastAsia="Arial" w:cs="Calibri"/>
-          <w:b w:val="0"/>
-        </w:rPr>
-        <w:t xml:space="preserve">This research received no specific grant from any funding agency in the public, commercial, or not-for-profit sectors. </w:t>
-      </w:r>
-    </w:p>
-    <w:p>
-      <w:pPr>
-        <w:pStyle w:val="3"/>
-        <w:spacing w:line="360" w:lineRule="auto"/>
-        <w:rPr>
-          <w:rFonts w:hint="default" w:ascii="Calibri" w:hAnsi="Calibri" w:cs="Calibri"/>
-        </w:rPr>
-      </w:pPr>
-      <w:r>
-        <w:rPr>
-          <w:rFonts w:hint="default" w:ascii="Calibri" w:hAnsi="Calibri" w:eastAsia="Arial" w:cs="Calibri"/>
-          <w:b/>
-        </w:rPr>
-        <w:t>Author contributions</w:t>
-      </w:r>
-    </w:p>
-    <w:p>
-      <w:pPr>
-        <w:spacing w:after="120" w:line="360" w:lineRule="auto"/>
-        <w:rPr>
-          <w:rFonts w:hint="default" w:ascii="Calibri" w:hAnsi="Calibri" w:cs="Calibri"/>
-        </w:rPr>
-      </w:pPr>
-      <w:r>
-        <w:rPr>
-          <w:rFonts w:hint="default" w:ascii="Calibri" w:hAnsi="Calibri" w:eastAsia="Arial" w:cs="Calibri"/>
-          <w:b w:val="0"/>
-          <w:bCs/>
-        </w:rPr>
-        <w:t>Jianhuang Huang:</w:t>
-      </w:r>
-      <w:r>
-        <w:rPr>
-          <w:rFonts w:hint="default" w:ascii="Calibri" w:hAnsi="Calibri" w:eastAsia="Arial" w:cs="Calibri"/>
-          <w:b w:val="0"/>
-        </w:rPr>
-        <w:t xml:space="preserve"> Conceptualization, Methodology, Software, Formal analysis, Data curation, Visualization, Writing – original draft. </w:t>
-      </w:r>
-      <w:r>
-        <w:rPr>
-          <w:rFonts w:hint="default" w:ascii="Calibri" w:hAnsi="Calibri" w:eastAsia="Arial" w:cs="Calibri"/>
-          <w:b w:val="0"/>
-          <w:bCs/>
-        </w:rPr>
-        <w:t>Jing Wang:</w:t>
-      </w:r>
-      <w:r>
-        <w:rPr>
-          <w:rFonts w:hint="default" w:ascii="Calibri" w:hAnsi="Calibri" w:eastAsia="Arial" w:cs="Calibri"/>
-          <w:b w:val="0"/>
-        </w:rPr>
-        <w:t xml:space="preserve"> Conceptualization, Resources, Supervision, Validation, Project administration, Writing – review &amp; editing. Both authors contributed to the conception and design of the work, interpreted the results, revised the manuscript critically for important intellectual content, approved the final version, and agree to be accountable for all aspects of the work. Correspondence and material requests should be addressed to the corresponding authors.</w:t>
-      </w:r>
-    </w:p>
-    <w:p>
-      <w:pPr>
-        <w:pStyle w:val="3"/>
-        <w:spacing w:line="360" w:lineRule="auto"/>
-        <w:rPr>
-          <w:rFonts w:hint="default" w:ascii="Calibri" w:hAnsi="Calibri" w:cs="Calibri"/>
-        </w:rPr>
-      </w:pPr>
-      <w:r>
-        <w:rPr>
-          <w:rFonts w:hint="default" w:ascii="Calibri" w:hAnsi="Calibri" w:cs="Calibri"/>
-          <w:b/>
-        </w:rPr>
-        <w:t>Competing interests</w:t>
-      </w:r>
-    </w:p>
-    <w:p>
-      <w:pPr>
-        <w:spacing w:after="120" w:line="360" w:lineRule="auto"/>
-        <w:rPr>
-          <w:rFonts w:hint="default" w:ascii="Calibri" w:hAnsi="Calibri" w:cs="Calibri"/>
-        </w:rPr>
-      </w:pPr>
-      <w:r>
-        <w:rPr>
-          <w:rFonts w:hint="default" w:ascii="Calibri" w:hAnsi="Calibri" w:eastAsia="Arial" w:cs="Calibri"/>
-          <w:b w:val="0"/>
-        </w:rPr>
-        <w:t>The authors declare no competing financial or non-financial interests.</w:t>
-      </w:r>
-    </w:p>
-    <w:p>
-      <w:pPr>
         <w:pBdr>
           <w:bottom w:val="single" w:color="999999" w:sz="6" w:space="1"/>
         </w:pBdr>
@@ -1521,23 +1335,6 @@
     </w:p>
     <w:p>
       <w:pPr>
-        <w:spacing w:after="120" w:line="360" w:lineRule="auto"/>
-        <w:rPr>
-          <w:rFonts w:hint="default" w:ascii="Calibri" w:hAnsi="Calibri" w:cs="Calibri"/>
-        </w:rPr>
-      </w:pPr>
-      <w:r>
-        <w:rPr>
-          <w:rFonts w:hint="default" w:ascii="Calibri" w:hAnsi="Calibri" w:eastAsia="Arial" w:cs="Calibri"/>
-          <w:b w:val="0"/>
-          <w:i/>
-          <w:iCs/>
-        </w:rPr>
-        <w:t>Supplementary Tables S1–S9 and Figures S1–S2 provide detailed cohort reconciliation, severity analyses, model diagnostics, sensitivity analyses, variable provenance and additional results. All supplementary values are generated from ‘numbers_v7.csv’.</w:t>
-      </w:r>
-    </w:p>
-    <w:p>
-      <w:pPr>
         <w:pBdr>
           <w:bottom w:val="single" w:color="999999" w:sz="6" w:space="1"/>
         </w:pBdr>
@@ -1546,6 +1343,202 @@
           <w:rFonts w:hint="default" w:ascii="Calibri" w:hAnsi="Calibri" w:cs="Calibri"/>
         </w:rPr>
       </w:pPr>
+    </w:p>
+    <w:p>
+      <w:pPr>
+        <w:pStyle w:val="3"/>
+        <w:spacing w:line="360" w:lineRule="auto"/>
+        <w:rPr>
+          <w:rFonts w:hint="default" w:ascii="Calibri" w:hAnsi="Calibri" w:cs="Calibri"/>
+        </w:rPr>
+      </w:pPr>
+      <w:r>
+        <w:rPr>
+          <w:rFonts w:hint="default" w:ascii="Calibri" w:hAnsi="Calibri" w:eastAsia="Arial" w:cs="Calibri"/>
+          <w:b/>
+        </w:rPr>
+        <w:t>Data availability</w:t>
+      </w:r>
+    </w:p>
+    <w:p>
+      <w:pPr>
+        <w:spacing w:after="120" w:line="360" w:lineRule="auto"/>
+        <w:rPr>
+          <w:rFonts w:hint="default" w:ascii="Calibri" w:hAnsi="Calibri" w:cs="Calibri"/>
+        </w:rPr>
+      </w:pPr>
+      <w:r>
+        <w:rPr>
+          <w:rFonts w:hint="default" w:ascii="Calibri" w:hAnsi="Calibri" w:eastAsia="Arial" w:cs="Calibri"/>
+          <w:b w:val="0"/>
+        </w:rPr>
+        <w:t>NHANES 2005–2008 retinal-photography (OPXRET), Vision (VIQ), Diabetes (DIQ), Demographics (DEMO), Health-Utilisation (HUQ) and Health-Insurance (HIQ) files, and the 2016 NHIS Sample Adult file, are publicly available from the National Center for Health Statistics, CDC (https://wwwn.cdc.gov/nchs/nhanes/ and https://ftp.cdc.gov/pub/Health_Statistics/NCHS/Datasets/NHIS/2016/). These are third-party public-use data; no individual-level data are redistributed here. This work is a secondary analysis of previously collected data.</w:t>
+      </w:r>
+    </w:p>
+    <w:p>
+      <w:pPr>
+        <w:spacing w:after="120" w:line="360" w:lineRule="auto"/>
+        <w:rPr>
+          <w:rFonts w:hint="default" w:ascii="Calibri" w:hAnsi="Calibri" w:cs="Calibri"/>
+        </w:rPr>
+      </w:pPr>
+      <w:r>
+        <w:rPr>
+          <w:rFonts w:hint="default" w:ascii="Calibri" w:hAnsi="Calibri" w:cs="Calibri"/>
+          <w:b w:val="0"/>
+          <w:bCs/>
+        </w:rPr>
+        <w:t>Code availability.</w:t>
+      </w:r>
+      <w:r>
+        <w:rPr>
+          <w:rFonts w:hint="default" w:ascii="Calibri" w:hAnsi="Calibri" w:cs="Calibri"/>
+          <w:b w:val="0"/>
+        </w:rPr>
+        <w:t xml:space="preserve"> </w:t>
+      </w:r>
+      <w:bookmarkStart w:id="0" w:name="_GoBack"/>
+      <w:bookmarkEnd w:id="0"/>
+      <w:r>
+        <w:rPr>
+          <w:rFonts w:hint="default" w:ascii="Calibri" w:hAnsi="Calibri" w:cs="Calibri"/>
+          <w:b w:val="0"/>
+        </w:rPr>
+        <w:t>The code used to produce all results in this study is available in a public GitHub repository at https://github.com/teamhuang/eye3-nhanes-diagnosis-care-gap (version-tagged release: https://github.com/teamhuang/eye3-nhanes-diagnosis-care-gap/releases/tag/v10.0.0).</w:t>
+      </w:r>
+    </w:p>
+    <w:p>
+      <w:pPr>
+        <w:pStyle w:val="3"/>
+        <w:spacing w:line="360" w:lineRule="auto"/>
+        <w:rPr>
+          <w:rFonts w:hint="default" w:ascii="Calibri" w:hAnsi="Calibri" w:cs="Calibri"/>
+        </w:rPr>
+      </w:pPr>
+      <w:r>
+        <w:rPr>
+          <w:rFonts w:hint="default" w:ascii="Calibri" w:hAnsi="Calibri" w:eastAsia="Arial" w:cs="Calibri"/>
+          <w:b/>
+        </w:rPr>
+        <w:t>Author contributions</w:t>
+      </w:r>
+    </w:p>
+    <w:p>
+      <w:pPr>
+        <w:spacing w:after="120" w:line="360" w:lineRule="auto"/>
+        <w:rPr>
+          <w:rFonts w:hint="default" w:ascii="Calibri" w:hAnsi="Calibri" w:cs="Calibri"/>
+        </w:rPr>
+      </w:pPr>
+      <w:r>
+        <w:rPr>
+          <w:rFonts w:hint="default" w:ascii="Calibri" w:hAnsi="Calibri" w:eastAsia="Arial" w:cs="Calibri"/>
+          <w:b w:val="0"/>
+          <w:bCs/>
+        </w:rPr>
+        <w:t>Jianhuang Huang:</w:t>
+      </w:r>
+      <w:r>
+        <w:rPr>
+          <w:rFonts w:hint="default" w:ascii="Calibri" w:hAnsi="Calibri" w:eastAsia="Arial" w:cs="Calibri"/>
+          <w:b w:val="0"/>
+        </w:rPr>
+        <w:t xml:space="preserve"> Conceptualization, Methodology, Software, Formal analysis, Data curation, Visualization, Writing – original draft. </w:t>
+      </w:r>
+      <w:r>
+        <w:rPr>
+          <w:rFonts w:hint="default" w:ascii="Calibri" w:hAnsi="Calibri" w:eastAsia="Arial" w:cs="Calibri"/>
+          <w:b w:val="0"/>
+          <w:bCs/>
+        </w:rPr>
+        <w:t>Jing Wang:</w:t>
+      </w:r>
+      <w:r>
+        <w:rPr>
+          <w:rFonts w:hint="default" w:ascii="Calibri" w:hAnsi="Calibri" w:eastAsia="Arial" w:cs="Calibri"/>
+          <w:b w:val="0"/>
+        </w:rPr>
+        <w:t xml:space="preserve"> Conceptualization, Resources, Supervision, Validation, Project administration, Writing – review &amp; editing. Both authors contributed to the conception and design of the work, interpreted the results, revised the manuscript critically for important intellectual content, approved the final version, and agree to be accountable for all aspects of the work. Correspondence and material requests should be addressed to the corresponding authors.</w:t>
+      </w:r>
+    </w:p>
+    <w:p>
+      <w:pPr>
+        <w:pStyle w:val="3"/>
+        <w:spacing w:line="360" w:lineRule="auto"/>
+        <w:rPr>
+          <w:rFonts w:hint="default" w:ascii="Calibri" w:hAnsi="Calibri" w:cs="Calibri"/>
+        </w:rPr>
+      </w:pPr>
+      <w:r>
+        <w:rPr>
+          <w:rFonts w:hint="default" w:ascii="Calibri" w:hAnsi="Calibri" w:eastAsia="Arial" w:cs="Calibri"/>
+          <w:b/>
+        </w:rPr>
+        <w:t>Funding</w:t>
+      </w:r>
+    </w:p>
+    <w:p>
+      <w:pPr>
+        <w:spacing w:after="120" w:line="360" w:lineRule="auto"/>
+        <w:rPr>
+          <w:rFonts w:hint="default" w:ascii="Calibri" w:hAnsi="Calibri" w:cs="Calibri"/>
+        </w:rPr>
+      </w:pPr>
+      <w:r>
+        <w:rPr>
+          <w:rFonts w:hint="default" w:ascii="Calibri" w:hAnsi="Calibri" w:eastAsia="Arial" w:cs="Calibri"/>
+          <w:b w:val="0"/>
+        </w:rPr>
+        <w:t xml:space="preserve">This research received no specific grant from any funding agency in the public, commercial, or not-for-profit sectors. </w:t>
+      </w:r>
+    </w:p>
+    <w:p>
+      <w:pPr>
+        <w:pStyle w:val="3"/>
+        <w:spacing w:line="360" w:lineRule="auto"/>
+        <w:rPr>
+          <w:rFonts w:hint="default" w:ascii="Calibri" w:hAnsi="Calibri" w:cs="Calibri"/>
+        </w:rPr>
+      </w:pPr>
+      <w:r>
+        <w:rPr>
+          <w:rFonts w:hint="default" w:ascii="Calibri" w:hAnsi="Calibri" w:cs="Calibri"/>
+          <w:b/>
+        </w:rPr>
+        <w:t>Competing interests</w:t>
+      </w:r>
+    </w:p>
+    <w:p>
+      <w:pPr>
+        <w:spacing w:after="120" w:line="360" w:lineRule="auto"/>
+        <w:rPr>
+          <w:rFonts w:hint="default" w:ascii="Calibri" w:hAnsi="Calibri" w:cs="Calibri"/>
+        </w:rPr>
+      </w:pPr>
+      <w:r>
+        <w:rPr>
+          <w:rFonts w:hint="default" w:ascii="Calibri" w:hAnsi="Calibri" w:eastAsia="Arial" w:cs="Calibri"/>
+          <w:b w:val="0"/>
+        </w:rPr>
+        <w:t>The authors declare no competing financial or non-financial interests.</w:t>
+      </w:r>
+    </w:p>
+    <w:p>
+      <w:pPr>
+        <w:spacing w:after="120" w:line="360" w:lineRule="auto"/>
+        <w:rPr>
+          <w:rFonts w:hint="default" w:ascii="Calibri" w:hAnsi="Calibri" w:cs="Calibri"/>
+        </w:rPr>
+      </w:pPr>
+      <w:r>
+        <w:rPr>
+          <w:rFonts w:hint="default" w:ascii="Calibri" w:hAnsi="Calibri" w:eastAsia="Arial" w:cs="Calibri"/>
+          <w:b w:val="0"/>
+          <w:i/>
+          <w:iCs/>
+        </w:rPr>
+        <w:t>Additional information. Supplementary Tables S1–S9 and Supplementary Figures S1–S2 are provided in a separate Supplementary Materials file and report cohort reconciliation, severity analyses, model diagnostics, sensitivity analyses and variable provenance. All supplementary values are generated from numbers_v7.csv.</w:t>
+      </w:r>
     </w:p>
     <w:p>
       <w:pPr>

</xml_diff>

<commit_message>
v10.0.0: Fig2 side-by-side panels (a left / b right), re-embedded at 8.5cm.
</commit_message>
<xml_diff>
--- a/manuscript/题目3手稿最新版本.docx
+++ b/manuscript/题目3手稿最新版本.docx
@@ -1949,7 +1949,7 @@
         <w:drawing>
           <wp:inline xmlns:a="http://schemas.openxmlformats.org/drawingml/2006/main" xmlns:pic="http://schemas.openxmlformats.org/drawingml/2006/picture">
             <wp:extent cx="1800000" cy="1800000"/>
-            <wp:docPr id="13" name="Picture 13"/>
+            <wp:docPr id="16" name="Picture 16"/>
             <wp:cNvGraphicFramePr>
               <a:graphicFrameLocks noChangeAspect="1"/>
             </wp:cNvGraphicFramePr>
@@ -1957,7 +1957,7 @@
               <a:graphicData uri="http://schemas.openxmlformats.org/drawingml/2006/picture">
                 <pic:pic>
                   <pic:nvPicPr>
-                    <pic:cNvPr id="0" name="Fig1_flowchart.png"/>
+                    <pic:cNvPr id="0" name="image.png"/>
                     <pic:cNvPicPr/>
                   </pic:nvPicPr>
                   <pic:blipFill>
@@ -1991,8 +1991,8 @@
       <w:r>
         <w:drawing>
           <wp:inline xmlns:a="http://schemas.openxmlformats.org/drawingml/2006/main" xmlns:pic="http://schemas.openxmlformats.org/drawingml/2006/picture">
-            <wp:extent cx="1800000" cy="1800000"/>
-            <wp:docPr id="14" name="Picture 14"/>
+            <wp:extent cx="3060000" cy="1800628"/>
+            <wp:docPr id="17" name="Picture 17"/>
             <wp:cNvGraphicFramePr>
               <a:graphicFrameLocks noChangeAspect="1"/>
             </wp:cNvGraphicFramePr>
@@ -2004,7 +2004,7 @@
                     <pic:cNvPicPr/>
                   </pic:nvPicPr>
                   <pic:blipFill>
-                    <a:blip r:embed="rId6"/>
+                    <a:blip r:embed="rId7"/>
                     <a:stretch>
                       <a:fillRect/>
                     </a:stretch>
@@ -2012,7 +2012,7 @@
                   <pic:spPr>
                     <a:xfrm>
                       <a:off x="0" y="0"/>
-                      <a:ext cx="1800000" cy="1800000"/>
+                      <a:ext cx="3060000" cy="1800628"/>
                     </a:xfrm>
                     <a:prstGeom prst="rect"/>
                   </pic:spPr>
@@ -2035,7 +2035,7 @@
         <w:drawing>
           <wp:inline xmlns:a="http://schemas.openxmlformats.org/drawingml/2006/main" xmlns:pic="http://schemas.openxmlformats.org/drawingml/2006/picture">
             <wp:extent cx="1800000" cy="1800000"/>
-            <wp:docPr id="15" name="Picture 15"/>
+            <wp:docPr id="18" name="Picture 18"/>
             <wp:cNvGraphicFramePr>
               <a:graphicFrameLocks noChangeAspect="1"/>
             </wp:cNvGraphicFramePr>

</xml_diff>

<commit_message>
v10.0.0: redesign Fig3 as clean lollipop; re-embed at 5cm.
</commit_message>
<xml_diff>
--- a/manuscript/题目3手稿最新版本.docx
+++ b/manuscript/题目3手稿最新版本.docx
@@ -1949,7 +1949,7 @@
         <w:drawing>
           <wp:inline xmlns:a="http://schemas.openxmlformats.org/drawingml/2006/main" xmlns:pic="http://schemas.openxmlformats.org/drawingml/2006/picture">
             <wp:extent cx="1800000" cy="1800000"/>
-            <wp:docPr id="16" name="Picture 16"/>
+            <wp:docPr id="19" name="Picture 19"/>
             <wp:cNvGraphicFramePr>
               <a:graphicFrameLocks noChangeAspect="1"/>
             </wp:cNvGraphicFramePr>
@@ -1992,7 +1992,7 @@
         <w:drawing>
           <wp:inline xmlns:a="http://schemas.openxmlformats.org/drawingml/2006/main" xmlns:pic="http://schemas.openxmlformats.org/drawingml/2006/picture">
             <wp:extent cx="3060000" cy="1800628"/>
-            <wp:docPr id="17" name="Picture 17"/>
+            <wp:docPr id="20" name="Picture 20"/>
             <wp:cNvGraphicFramePr>
               <a:graphicFrameLocks noChangeAspect="1"/>
             </wp:cNvGraphicFramePr>
@@ -2000,7 +2000,7 @@
               <a:graphicData uri="http://schemas.openxmlformats.org/drawingml/2006/picture">
                 <pic:pic>
                   <pic:nvPicPr>
-                    <pic:cNvPr id="0" name="Fig2_gradient_forest.png"/>
+                    <pic:cNvPr id="0" name="image.png"/>
                     <pic:cNvPicPr/>
                   </pic:nvPicPr>
                   <pic:blipFill>
@@ -2035,7 +2035,7 @@
         <w:drawing>
           <wp:inline xmlns:a="http://schemas.openxmlformats.org/drawingml/2006/main" xmlns:pic="http://schemas.openxmlformats.org/drawingml/2006/picture">
             <wp:extent cx="1800000" cy="1800000"/>
-            <wp:docPr id="18" name="Picture 18"/>
+            <wp:docPr id="21" name="Picture 21"/>
             <wp:cNvGraphicFramePr>
               <a:graphicFrameLocks noChangeAspect="1"/>
             </wp:cNvGraphicFramePr>
@@ -2043,11 +2043,11 @@
               <a:graphicData uri="http://schemas.openxmlformats.org/drawingml/2006/picture">
                 <pic:pic>
                   <pic:nvPicPr>
-                    <pic:cNvPr id="0" name="image.png"/>
+                    <pic:cNvPr id="0" name="Fig3_eyecare_dots.png"/>
                     <pic:cNvPicPr/>
                   </pic:nvPicPr>
                   <pic:blipFill>
-                    <a:blip r:embed="rId13"/>
+                    <a:blip r:embed="rId6"/>
                     <a:stretch>
                       <a:fillRect/>
                     </a:stretch>

</xml_diff>